<commit_message>
Actualizar fig1 con version de mejor calidad
Se reemplaza el diagrama relacional por la version de mayor
resolucion (ya con la relacion invernaderos-lotes corregida). De
paso se detecto que el fig2 embebido en el Word habia vuelto a la
version vieja sin tilde en "Aplicacion"; se corrigio tambien.
</commit_message>
<xml_diff>
--- a/docs/Grupo8_Vivero_NativaCR_Avance_II.docx
+++ b/docs/Grupo8_Vivero_NativaCR_Avance_II.docx
@@ -330,7 +330,7 @@
           <w:r>
             <w:fldChar w:fldCharType="separate"/>
           </w:r>
-          <w:hyperlink w:anchor="_Toc234520369" w:history="1">
+          <w:hyperlink w:anchor="_Toc234521228" w:history="1">
             <w:r>
               <w:rPr>
                 <w:rStyle w:val="Hyperlink"/>
@@ -355,7 +355,7 @@
               <w:rPr>
                 <w:noProof/>
               </w:rPr>
-              <w:instrText xml:space="preserve"> PAGEREF _Toc234520369 \h </w:instrText>
+              <w:instrText xml:space="preserve"> PAGEREF _Toc234521228 \h </w:instrText>
             </w:r>
             <w:r>
               <w:rPr>
@@ -398,7 +398,7 @@
               <w14:ligatures w14:val="standardContextual"/>
             </w:rPr>
           </w:pPr>
-          <w:hyperlink w:anchor="_Toc234520370" w:history="1">
+          <w:hyperlink w:anchor="_Toc234521229" w:history="1">
             <w:r>
               <w:rPr>
                 <w:rStyle w:val="Hyperlink"/>
@@ -423,7 +423,7 @@
               <w:rPr>
                 <w:noProof/>
               </w:rPr>
-              <w:instrText xml:space="preserve"> PAGEREF _Toc234520370 \h </w:instrText>
+              <w:instrText xml:space="preserve"> PAGEREF _Toc234521229 \h </w:instrText>
             </w:r>
             <w:r>
               <w:rPr>
@@ -466,7 +466,7 @@
               <w14:ligatures w14:val="standardContextual"/>
             </w:rPr>
           </w:pPr>
-          <w:hyperlink w:anchor="_Toc234520371" w:history="1">
+          <w:hyperlink w:anchor="_Toc234521230" w:history="1">
             <w:r>
               <w:rPr>
                 <w:rStyle w:val="Hyperlink"/>
@@ -491,7 +491,7 @@
               <w:rPr>
                 <w:noProof/>
               </w:rPr>
-              <w:instrText xml:space="preserve"> PAGEREF _Toc234520371 \h </w:instrText>
+              <w:instrText xml:space="preserve"> PAGEREF _Toc234521230 \h </w:instrText>
             </w:r>
             <w:r>
               <w:rPr>
@@ -534,7 +534,7 @@
               <w14:ligatures w14:val="standardContextual"/>
             </w:rPr>
           </w:pPr>
-          <w:hyperlink w:anchor="_Toc234520372" w:history="1">
+          <w:hyperlink w:anchor="_Toc234521231" w:history="1">
             <w:r>
               <w:rPr>
                 <w:rStyle w:val="Hyperlink"/>
@@ -558,7 +558,7 @@
               <w:rPr>
                 <w:noProof/>
               </w:rPr>
-              <w:instrText xml:space="preserve"> PAGEREF _Toc234520372 \h </w:instrText>
+              <w:instrText xml:space="preserve"> PAGEREF _Toc234521231 \h </w:instrText>
             </w:r>
             <w:r>
               <w:rPr>
@@ -601,7 +601,7 @@
               <w14:ligatures w14:val="standardContextual"/>
             </w:rPr>
           </w:pPr>
-          <w:hyperlink w:anchor="_Toc234520373" w:history="1">
+          <w:hyperlink w:anchor="_Toc234521232" w:history="1">
             <w:r>
               <w:rPr>
                 <w:rStyle w:val="Hyperlink"/>
@@ -625,7 +625,7 @@
               <w:rPr>
                 <w:noProof/>
               </w:rPr>
-              <w:instrText xml:space="preserve"> PAGEREF _Toc234520373 \h </w:instrText>
+              <w:instrText xml:space="preserve"> PAGEREF _Toc234521232 \h </w:instrText>
             </w:r>
             <w:r>
               <w:rPr>
@@ -668,7 +668,7 @@
               <w14:ligatures w14:val="standardContextual"/>
             </w:rPr>
           </w:pPr>
-          <w:hyperlink w:anchor="_Toc234520374" w:history="1">
+          <w:hyperlink w:anchor="_Toc234521233" w:history="1">
             <w:r>
               <w:rPr>
                 <w:rStyle w:val="Hyperlink"/>
@@ -693,7 +693,7 @@
               <w:rPr>
                 <w:noProof/>
               </w:rPr>
-              <w:instrText xml:space="preserve"> PAGEREF _Toc234520374 \h </w:instrText>
+              <w:instrText xml:space="preserve"> PAGEREF _Toc234521233 \h </w:instrText>
             </w:r>
             <w:r>
               <w:rPr>
@@ -736,7 +736,7 @@
               <w14:ligatures w14:val="standardContextual"/>
             </w:rPr>
           </w:pPr>
-          <w:hyperlink w:anchor="_Toc234520375" w:history="1">
+          <w:hyperlink w:anchor="_Toc234521234" w:history="1">
             <w:r>
               <w:rPr>
                 <w:rStyle w:val="Hyperlink"/>
@@ -761,7 +761,7 @@
               <w:rPr>
                 <w:noProof/>
               </w:rPr>
-              <w:instrText xml:space="preserve"> PAGEREF _Toc234520375 \h </w:instrText>
+              <w:instrText xml:space="preserve"> PAGEREF _Toc234521234 \h </w:instrText>
             </w:r>
             <w:r>
               <w:rPr>
@@ -804,7 +804,7 @@
               <w14:ligatures w14:val="standardContextual"/>
             </w:rPr>
           </w:pPr>
-          <w:hyperlink w:anchor="_Toc234520376" w:history="1">
+          <w:hyperlink w:anchor="_Toc234521235" w:history="1">
             <w:r>
               <w:rPr>
                 <w:rStyle w:val="Hyperlink"/>
@@ -829,7 +829,7 @@
               <w:rPr>
                 <w:noProof/>
               </w:rPr>
-              <w:instrText xml:space="preserve"> PAGEREF _Toc234520376 \h </w:instrText>
+              <w:instrText xml:space="preserve"> PAGEREF _Toc234521235 \h </w:instrText>
             </w:r>
             <w:r>
               <w:rPr>
@@ -872,7 +872,7 @@
               <w14:ligatures w14:val="standardContextual"/>
             </w:rPr>
           </w:pPr>
-          <w:hyperlink w:anchor="_Toc234520377" w:history="1">
+          <w:hyperlink w:anchor="_Toc234521236" w:history="1">
             <w:r>
               <w:rPr>
                 <w:rStyle w:val="Hyperlink"/>
@@ -897,7 +897,7 @@
               <w:rPr>
                 <w:noProof/>
               </w:rPr>
-              <w:instrText xml:space="preserve"> PAGEREF _Toc234520377 \h </w:instrText>
+              <w:instrText xml:space="preserve"> PAGEREF _Toc234521236 \h </w:instrText>
             </w:r>
             <w:r>
               <w:rPr>
@@ -940,7 +940,7 @@
               <w14:ligatures w14:val="standardContextual"/>
             </w:rPr>
           </w:pPr>
-          <w:hyperlink w:anchor="_Toc234520378" w:history="1">
+          <w:hyperlink w:anchor="_Toc234521237" w:history="1">
             <w:r>
               <w:rPr>
                 <w:rStyle w:val="Hyperlink"/>
@@ -965,7 +965,7 @@
               <w:rPr>
                 <w:noProof/>
               </w:rPr>
-              <w:instrText xml:space="preserve"> PAGEREF _Toc234520378 \h </w:instrText>
+              <w:instrText xml:space="preserve"> PAGEREF _Toc234521237 \h </w:instrText>
             </w:r>
             <w:r>
               <w:rPr>
@@ -1008,7 +1008,7 @@
               <w14:ligatures w14:val="standardContextual"/>
             </w:rPr>
           </w:pPr>
-          <w:hyperlink w:anchor="_Toc234520379" w:history="1">
+          <w:hyperlink w:anchor="_Toc234521238" w:history="1">
             <w:r>
               <w:rPr>
                 <w:rStyle w:val="Hyperlink"/>
@@ -1033,7 +1033,7 @@
               <w:rPr>
                 <w:noProof/>
               </w:rPr>
-              <w:instrText xml:space="preserve"> PAGEREF _Toc234520379 \h </w:instrText>
+              <w:instrText xml:space="preserve"> PAGEREF _Toc234521238 \h </w:instrText>
             </w:r>
             <w:r>
               <w:rPr>
@@ -1076,7 +1076,7 @@
               <w14:ligatures w14:val="standardContextual"/>
             </w:rPr>
           </w:pPr>
-          <w:hyperlink w:anchor="_Toc234520380" w:history="1">
+          <w:hyperlink w:anchor="_Toc234521239" w:history="1">
             <w:r>
               <w:rPr>
                 <w:rStyle w:val="Hyperlink"/>
@@ -1100,7 +1100,7 @@
               <w:rPr>
                 <w:noProof/>
               </w:rPr>
-              <w:instrText xml:space="preserve"> PAGEREF _Toc234520380 \h </w:instrText>
+              <w:instrText xml:space="preserve"> PAGEREF _Toc234521239 \h </w:instrText>
             </w:r>
             <w:r>
               <w:rPr>
@@ -1143,7 +1143,7 @@
               <w14:ligatures w14:val="standardContextual"/>
             </w:rPr>
           </w:pPr>
-          <w:hyperlink w:anchor="_Toc234520381" w:history="1">
+          <w:hyperlink w:anchor="_Toc234521240" w:history="1">
             <w:r>
               <w:rPr>
                 <w:rStyle w:val="Hyperlink"/>
@@ -1168,7 +1168,7 @@
               <w:rPr>
                 <w:noProof/>
               </w:rPr>
-              <w:instrText xml:space="preserve"> PAGEREF _Toc234520381 \h </w:instrText>
+              <w:instrText xml:space="preserve"> PAGEREF _Toc234521240 \h </w:instrText>
             </w:r>
             <w:r>
               <w:rPr>
@@ -1211,7 +1211,7 @@
               <w14:ligatures w14:val="standardContextual"/>
             </w:rPr>
           </w:pPr>
-          <w:hyperlink w:anchor="_Toc234520382" w:history="1">
+          <w:hyperlink w:anchor="_Toc234521241" w:history="1">
             <w:r>
               <w:rPr>
                 <w:rStyle w:val="Hyperlink"/>
@@ -1236,7 +1236,7 @@
               <w:rPr>
                 <w:noProof/>
               </w:rPr>
-              <w:instrText xml:space="preserve"> PAGEREF _Toc234520382 \h </w:instrText>
+              <w:instrText xml:space="preserve"> PAGEREF _Toc234521241 \h </w:instrText>
             </w:r>
             <w:r>
               <w:rPr>
@@ -1279,7 +1279,7 @@
               <w14:ligatures w14:val="standardContextual"/>
             </w:rPr>
           </w:pPr>
-          <w:hyperlink w:anchor="_Toc234520383" w:history="1">
+          <w:hyperlink w:anchor="_Toc234521242" w:history="1">
             <w:r>
               <w:rPr>
                 <w:rStyle w:val="Hyperlink"/>
@@ -1304,7 +1304,7 @@
               <w:rPr>
                 <w:noProof/>
               </w:rPr>
-              <w:instrText xml:space="preserve"> PAGEREF _Toc234520383 \h </w:instrText>
+              <w:instrText xml:space="preserve"> PAGEREF _Toc234521242 \h </w:instrText>
             </w:r>
             <w:r>
               <w:rPr>
@@ -1347,7 +1347,7 @@
               <w14:ligatures w14:val="standardContextual"/>
             </w:rPr>
           </w:pPr>
-          <w:hyperlink w:anchor="_Toc234520384" w:history="1">
+          <w:hyperlink w:anchor="_Toc234521243" w:history="1">
             <w:r>
               <w:rPr>
                 <w:rStyle w:val="Hyperlink"/>
@@ -1371,7 +1371,7 @@
               <w:rPr>
                 <w:noProof/>
               </w:rPr>
-              <w:instrText xml:space="preserve"> PAGEREF _Toc234520384 \h </w:instrText>
+              <w:instrText xml:space="preserve"> PAGEREF _Toc234521243 \h </w:instrText>
             </w:r>
             <w:r>
               <w:rPr>
@@ -1414,7 +1414,7 @@
               <w14:ligatures w14:val="standardContextual"/>
             </w:rPr>
           </w:pPr>
-          <w:hyperlink w:anchor="_Toc234520385" w:history="1">
+          <w:hyperlink w:anchor="_Toc234521244" w:history="1">
             <w:r>
               <w:rPr>
                 <w:rStyle w:val="Hyperlink"/>
@@ -1438,7 +1438,7 @@
               <w:rPr>
                 <w:noProof/>
               </w:rPr>
-              <w:instrText xml:space="preserve"> PAGEREF _Toc234520385 \h </w:instrText>
+              <w:instrText xml:space="preserve"> PAGEREF _Toc234521244 \h </w:instrText>
             </w:r>
             <w:r>
               <w:rPr>
@@ -1481,7 +1481,7 @@
               <w14:ligatures w14:val="standardContextual"/>
             </w:rPr>
           </w:pPr>
-          <w:hyperlink w:anchor="_Toc234520386" w:history="1">
+          <w:hyperlink w:anchor="_Toc234521245" w:history="1">
             <w:r>
               <w:rPr>
                 <w:rStyle w:val="Hyperlink"/>
@@ -1506,7 +1506,7 @@
               <w:rPr>
                 <w:noProof/>
               </w:rPr>
-              <w:instrText xml:space="preserve"> PAGEREF _Toc234520386 \h </w:instrText>
+              <w:instrText xml:space="preserve"> PAGEREF _Toc234521245 \h </w:instrText>
             </w:r>
             <w:r>
               <w:rPr>
@@ -1549,7 +1549,7 @@
               <w14:ligatures w14:val="standardContextual"/>
             </w:rPr>
           </w:pPr>
-          <w:hyperlink w:anchor="_Toc234520387" w:history="1">
+          <w:hyperlink w:anchor="_Toc234521246" w:history="1">
             <w:r>
               <w:rPr>
                 <w:rStyle w:val="Hyperlink"/>
@@ -1573,7 +1573,7 @@
               <w:rPr>
                 <w:noProof/>
               </w:rPr>
-              <w:instrText xml:space="preserve"> PAGEREF _Toc234520387 \h </w:instrText>
+              <w:instrText xml:space="preserve"> PAGEREF _Toc234521246 \h </w:instrText>
             </w:r>
             <w:r>
               <w:rPr>
@@ -1616,7 +1616,7 @@
               <w14:ligatures w14:val="standardContextual"/>
             </w:rPr>
           </w:pPr>
-          <w:hyperlink w:anchor="_Toc234520388" w:history="1">
+          <w:hyperlink w:anchor="_Toc234521247" w:history="1">
             <w:r>
               <w:rPr>
                 <w:rStyle w:val="Hyperlink"/>
@@ -1641,7 +1641,7 @@
               <w:rPr>
                 <w:noProof/>
               </w:rPr>
-              <w:instrText xml:space="preserve"> PAGEREF _Toc234520388 \h </w:instrText>
+              <w:instrText xml:space="preserve"> PAGEREF _Toc234521247 \h </w:instrText>
             </w:r>
             <w:r>
               <w:rPr>
@@ -1684,7 +1684,7 @@
               <w14:ligatures w14:val="standardContextual"/>
             </w:rPr>
           </w:pPr>
-          <w:hyperlink w:anchor="_Toc234520389" w:history="1">
+          <w:hyperlink w:anchor="_Toc234521248" w:history="1">
             <w:r>
               <w:rPr>
                 <w:rStyle w:val="Hyperlink"/>
@@ -1708,7 +1708,7 @@
               <w:rPr>
                 <w:noProof/>
               </w:rPr>
-              <w:instrText xml:space="preserve"> PAGEREF _Toc234520389 \h </w:instrText>
+              <w:instrText xml:space="preserve"> PAGEREF _Toc234521248 \h </w:instrText>
             </w:r>
             <w:r>
               <w:rPr>
@@ -1754,7 +1754,7 @@
           <w:lang w:val="es-419"/>
         </w:rPr>
       </w:pPr>
-      <w:bookmarkStart w:id="0" w:name="_Toc234520369"/>
+      <w:bookmarkStart w:id="0" w:name="_Toc234521228"/>
       <w:r>
         <w:rPr>
           <w:lang w:val="es-419"/>
@@ -1771,7 +1771,7 @@
           <w:lang w:val="es-419"/>
         </w:rPr>
       </w:pPr>
-      <w:bookmarkStart w:id="1" w:name="_Toc234520370"/>
+      <w:bookmarkStart w:id="1" w:name="_Toc234521229"/>
       <w:r>
         <w:rPr>
           <w:lang w:val="es-419"/>
@@ -1815,7 +1815,7 @@
           <w:lang w:val="es-419"/>
         </w:rPr>
       </w:pPr>
-      <w:bookmarkStart w:id="2" w:name="_Toc234520371"/>
+      <w:bookmarkStart w:id="2" w:name="_Toc234521230"/>
       <w:r>
         <w:rPr>
           <w:lang w:val="es-419"/>
@@ -1842,7 +1842,7 @@
       <w:pPr>
         <w:pStyle w:val="Heading2"/>
       </w:pPr>
-      <w:bookmarkStart w:id="3" w:name="_Toc234520372"/>
+      <w:bookmarkStart w:id="3" w:name="_Toc234521231"/>
       <w:r>
         <w:t>Objetivos específicos</w:t>
       </w:r>
@@ -1922,7 +1922,7 @@
       <w:pPr>
         <w:pStyle w:val="Heading1"/>
       </w:pPr>
-      <w:bookmarkStart w:id="4" w:name="_Toc234520373"/>
+      <w:bookmarkStart w:id="4" w:name="_Toc234521232"/>
       <w:r>
         <w:lastRenderedPageBreak/>
         <w:t>Capítulo 2. Descripción de la empresa</w:t>
@@ -2271,7 +2271,7 @@
           <w:lang w:val="es-419"/>
         </w:rPr>
       </w:pPr>
-      <w:bookmarkStart w:id="5" w:name="_Toc234520374"/>
+      <w:bookmarkStart w:id="5" w:name="_Toc234521233"/>
       <w:r>
         <w:rPr>
           <w:lang w:val="es-419"/>
@@ -2301,7 +2301,7 @@
           <w:lang w:val="es-419"/>
         </w:rPr>
       </w:pPr>
-      <w:bookmarkStart w:id="6" w:name="_Toc234520375"/>
+      <w:bookmarkStart w:id="6" w:name="_Toc234521234"/>
       <w:r>
         <w:rPr>
           <w:lang w:val="es-419"/>
@@ -2331,7 +2331,7 @@
           <w:lang w:val="es-419"/>
         </w:rPr>
       </w:pPr>
-      <w:bookmarkStart w:id="7" w:name="_Toc234520376"/>
+      <w:bookmarkStart w:id="7" w:name="_Toc234521235"/>
       <w:r>
         <w:rPr>
           <w:lang w:val="es-419"/>
@@ -2374,7 +2374,7 @@
           <w:lang w:val="es-419"/>
         </w:rPr>
       </w:pPr>
-      <w:bookmarkStart w:id="8" w:name="_Toc234520377"/>
+      <w:bookmarkStart w:id="8" w:name="_Toc234521236"/>
       <w:r>
         <w:rPr>
           <w:lang w:val="es-419"/>
@@ -2391,7 +2391,7 @@
           <w:lang w:val="es-419"/>
         </w:rPr>
       </w:pPr>
-      <w:bookmarkStart w:id="9" w:name="_Toc234520378"/>
+      <w:bookmarkStart w:id="9" w:name="_Toc234521237"/>
       <w:r>
         <w:rPr>
           <w:lang w:val="es-419"/>
@@ -2450,7 +2450,7 @@
           <w:lang w:val="es-419"/>
         </w:rPr>
       </w:pPr>
-      <w:bookmarkStart w:id="10" w:name="_Toc234520379"/>
+      <w:bookmarkStart w:id="10" w:name="_Toc234521238"/>
       <w:r>
         <w:rPr>
           <w:lang w:val="es-419"/>
@@ -2477,14 +2477,6 @@
       <w:pPr>
         <w:spacing w:after="160"/>
         <w:rPr>
-          <w:noProof/>
-        </w:rPr>
-      </w:pPr>
-    </w:p>
-    <w:p>
-      <w:pPr>
-        <w:spacing w:after="160"/>
-        <w:rPr>
           <w:lang w:val="es-419"/>
         </w:rPr>
       </w:pPr>
@@ -2493,10 +2485,10 @@
           <w:noProof/>
         </w:rPr>
         <w:drawing>
-          <wp:inline distT="0" distB="0" distL="0" distR="0" wp14:anchorId="0599D3FC" wp14:editId="105922B9">
-            <wp:extent cx="5943600" cy="4145200"/>
+          <wp:inline distT="0" distB="0" distL="0" distR="0" wp14:anchorId="60CCA06D" wp14:editId="4EF5BDF5">
+            <wp:extent cx="5943600" cy="4457700"/>
             <wp:effectExtent l="0" t="0" r="0" b="0"/>
-            <wp:docPr id="579042126" name="Picture 2"/>
+            <wp:docPr id="2007888752" name="Picture 2"/>
             <wp:cNvGraphicFramePr>
               <a:graphicFrameLocks xmlns:a="http://schemas.openxmlformats.org/drawingml/2006/main" noChangeAspect="1"/>
             </wp:cNvGraphicFramePr>
@@ -2525,7 +2517,7 @@
                   <pic:spPr bwMode="auto">
                     <a:xfrm>
                       <a:off x="0" y="0"/>
-                      <a:ext cx="5943600" cy="4145200"/>
+                      <a:ext cx="5943600" cy="4457700"/>
                     </a:xfrm>
                     <a:prstGeom prst="rect">
                       <a:avLst/>
@@ -3405,7 +3397,7 @@
       <w:pPr>
         <w:pStyle w:val="Heading2"/>
       </w:pPr>
-      <w:bookmarkStart w:id="11" w:name="_Toc234520380"/>
+      <w:bookmarkStart w:id="11" w:name="_Toc234521239"/>
       <w:r>
         <w:t>Requerimientos de usuario</w:t>
       </w:r>
@@ -4232,7 +4224,7 @@
           <w:lang w:val="es-419"/>
         </w:rPr>
       </w:pPr>
-      <w:bookmarkStart w:id="12" w:name="_Toc234520381"/>
+      <w:bookmarkStart w:id="12" w:name="_Toc234521240"/>
       <w:r>
         <w:rPr>
           <w:lang w:val="es-419"/>
@@ -4427,7 +4419,7 @@
           <w:lang w:val="es-419"/>
         </w:rPr>
       </w:pPr>
-      <w:bookmarkStart w:id="13" w:name="_Toc234520382"/>
+      <w:bookmarkStart w:id="13" w:name="_Toc234521241"/>
       <w:r>
         <w:rPr>
           <w:lang w:val="es-419"/>
@@ -4457,7 +4449,7 @@
           <w:lang w:val="es-419"/>
         </w:rPr>
       </w:pPr>
-      <w:bookmarkStart w:id="14" w:name="_Toc234520383"/>
+      <w:bookmarkStart w:id="14" w:name="_Toc234521242"/>
       <w:r>
         <w:rPr>
           <w:lang w:val="es-419"/>
@@ -5126,7 +5118,7 @@
       <w:pPr>
         <w:pStyle w:val="Heading2"/>
       </w:pPr>
-      <w:bookmarkStart w:id="15" w:name="_Toc234520384"/>
+      <w:bookmarkStart w:id="15" w:name="_Toc234521243"/>
       <w:r>
         <w:t>Diccionario de datos</w:t>
       </w:r>
@@ -5654,10 +5646,16 @@
             <w:vAlign w:val="center"/>
           </w:tcPr>
           <w:p>
-            <w:r>
-              <w:rPr>
-                <w:sz w:val="16"/>
-                <w:szCs w:val="16"/>
+            <w:pPr>
+              <w:rPr>
+                <w:lang w:val="es-419"/>
+              </w:rPr>
+            </w:pPr>
+            <w:r>
+              <w:rPr>
+                <w:sz w:val="16"/>
+                <w:szCs w:val="16"/>
+                <w:lang w:val="es-419"/>
               </w:rPr>
               <w:t>Identificador de la zona biológica</w:t>
             </w:r>
@@ -5884,8 +5882,16 @@
               <w:rPr>
                 <w:sz w:val="16"/>
                 <w:szCs w:val="16"/>
-              </w:rPr>
-              <w:t>Nombre de la zona (p. ej. Bosque seco tropical)</w:t>
+                <w:lang w:val="es-419"/>
+              </w:rPr>
+              <w:t xml:space="preserve">Nombre de la zona (p. ej. </w:t>
+            </w:r>
+            <w:r>
+              <w:rPr>
+                <w:sz w:val="16"/>
+                <w:szCs w:val="16"/>
+              </w:rPr>
+              <w:t>Bosque seco tropical)</w:t>
             </w:r>
           </w:p>
         </w:tc>
@@ -6106,10 +6112,16 @@
             <w:vAlign w:val="center"/>
           </w:tcPr>
           <w:p>
-            <w:r>
-              <w:rPr>
-                <w:sz w:val="16"/>
-                <w:szCs w:val="16"/>
+            <w:pPr>
+              <w:rPr>
+                <w:lang w:val="es-419"/>
+              </w:rPr>
+            </w:pPr>
+            <w:r>
+              <w:rPr>
+                <w:sz w:val="16"/>
+                <w:szCs w:val="16"/>
+                <w:lang w:val="es-419"/>
               </w:rPr>
               <w:t>Descripción libre de la zona</w:t>
             </w:r>
@@ -6852,10 +6864,16 @@
             <w:vAlign w:val="center"/>
           </w:tcPr>
           <w:p>
-            <w:r>
-              <w:rPr>
-                <w:sz w:val="16"/>
-                <w:szCs w:val="16"/>
+            <w:pPr>
+              <w:rPr>
+                <w:lang w:val="es-419"/>
+              </w:rPr>
+            </w:pPr>
+            <w:r>
+              <w:rPr>
+                <w:sz w:val="16"/>
+                <w:szCs w:val="16"/>
+                <w:lang w:val="es-419"/>
               </w:rPr>
               <w:t>Zona biológica a la que pertenece</w:t>
             </w:r>
@@ -7078,10 +7096,16 @@
             <w:vAlign w:val="center"/>
           </w:tcPr>
           <w:p>
-            <w:r>
-              <w:rPr>
-                <w:sz w:val="16"/>
-                <w:szCs w:val="16"/>
+            <w:pPr>
+              <w:rPr>
+                <w:lang w:val="es-419"/>
+              </w:rPr>
+            </w:pPr>
+            <w:r>
+              <w:rPr>
+                <w:sz w:val="16"/>
+                <w:szCs w:val="16"/>
+                <w:lang w:val="es-419"/>
               </w:rPr>
               <w:t>Nombre científico de la planta</w:t>
             </w:r>
@@ -7304,10 +7328,16 @@
             <w:vAlign w:val="center"/>
           </w:tcPr>
           <w:p>
-            <w:r>
-              <w:rPr>
-                <w:sz w:val="16"/>
-                <w:szCs w:val="16"/>
+            <w:pPr>
+              <w:rPr>
+                <w:lang w:val="es-419"/>
+              </w:rPr>
+            </w:pPr>
+            <w:r>
+              <w:rPr>
+                <w:sz w:val="16"/>
+                <w:szCs w:val="16"/>
+                <w:lang w:val="es-419"/>
               </w:rPr>
               <w:t>Nombre común de la planta</w:t>
             </w:r>
@@ -7530,10 +7560,16 @@
             <w:vAlign w:val="center"/>
           </w:tcPr>
           <w:p>
-            <w:r>
-              <w:rPr>
-                <w:sz w:val="16"/>
-                <w:szCs w:val="16"/>
+            <w:pPr>
+              <w:rPr>
+                <w:lang w:val="es-419"/>
+              </w:rPr>
+            </w:pPr>
+            <w:r>
+              <w:rPr>
+                <w:sz w:val="16"/>
+                <w:szCs w:val="16"/>
+                <w:lang w:val="es-419"/>
               </w:rPr>
               <w:t>Precio de venta por unidad</w:t>
             </w:r>
@@ -7756,10 +7792,16 @@
             <w:vAlign w:val="center"/>
           </w:tcPr>
           <w:p>
-            <w:r>
-              <w:rPr>
-                <w:sz w:val="16"/>
-                <w:szCs w:val="16"/>
+            <w:pPr>
+              <w:rPr>
+                <w:lang w:val="es-419"/>
+              </w:rPr>
+            </w:pPr>
+            <w:r>
+              <w:rPr>
+                <w:sz w:val="16"/>
+                <w:szCs w:val="16"/>
+                <w:lang w:val="es-419"/>
               </w:rPr>
               <w:t>Descripción extensa de la especie</w:t>
             </w:r>
@@ -9698,10 +9740,16 @@
             <w:vAlign w:val="center"/>
           </w:tcPr>
           <w:p>
-            <w:r>
-              <w:rPr>
-                <w:sz w:val="16"/>
-                <w:szCs w:val="16"/>
+            <w:pPr>
+              <w:rPr>
+                <w:lang w:val="es-419"/>
+              </w:rPr>
+            </w:pPr>
+            <w:r>
+              <w:rPr>
+                <w:sz w:val="16"/>
+                <w:szCs w:val="16"/>
+                <w:lang w:val="es-419"/>
               </w:rPr>
               <w:t>Especie sembrada en el lote</w:t>
             </w:r>
@@ -10150,10 +10198,16 @@
             <w:vAlign w:val="center"/>
           </w:tcPr>
           <w:p>
-            <w:r>
-              <w:rPr>
-                <w:sz w:val="16"/>
-                <w:szCs w:val="16"/>
+            <w:pPr>
+              <w:rPr>
+                <w:lang w:val="es-419"/>
+              </w:rPr>
+            </w:pPr>
+            <w:r>
+              <w:rPr>
+                <w:sz w:val="16"/>
+                <w:szCs w:val="16"/>
+                <w:lang w:val="es-419"/>
               </w:rPr>
               <w:t>Cantidad de plantas del lote</w:t>
             </w:r>
@@ -10376,10 +10430,16 @@
             <w:vAlign w:val="center"/>
           </w:tcPr>
           <w:p>
-            <w:r>
-              <w:rPr>
-                <w:sz w:val="16"/>
-                <w:szCs w:val="16"/>
+            <w:pPr>
+              <w:rPr>
+                <w:lang w:val="es-419"/>
+              </w:rPr>
+            </w:pPr>
+            <w:r>
+              <w:rPr>
+                <w:sz w:val="16"/>
+                <w:szCs w:val="16"/>
+                <w:lang w:val="es-419"/>
               </w:rPr>
               <w:t>Fecha en que se sembró el lote</w:t>
             </w:r>
@@ -12771,10 +12831,16 @@
             <w:vAlign w:val="center"/>
           </w:tcPr>
           <w:p>
-            <w:r>
-              <w:rPr>
-                <w:sz w:val="16"/>
-                <w:szCs w:val="16"/>
+            <w:pPr>
+              <w:rPr>
+                <w:lang w:val="es-419"/>
+              </w:rPr>
+            </w:pPr>
+            <w:r>
+              <w:rPr>
+                <w:sz w:val="16"/>
+                <w:szCs w:val="16"/>
+                <w:lang w:val="es-419"/>
               </w:rPr>
               <w:t>Cliente que realiza el pedido</w:t>
             </w:r>
@@ -12997,10 +13063,16 @@
             <w:vAlign w:val="center"/>
           </w:tcPr>
           <w:p>
-            <w:r>
-              <w:rPr>
-                <w:sz w:val="16"/>
-                <w:szCs w:val="16"/>
+            <w:pPr>
+              <w:rPr>
+                <w:lang w:val="es-419"/>
+              </w:rPr>
+            </w:pPr>
+            <w:r>
+              <w:rPr>
+                <w:sz w:val="16"/>
+                <w:szCs w:val="16"/>
+                <w:lang w:val="es-419"/>
               </w:rPr>
               <w:t>Fecha y hora del pedido</w:t>
             </w:r>
@@ -13449,10 +13521,16 @@
             <w:vAlign w:val="center"/>
           </w:tcPr>
           <w:p>
-            <w:r>
-              <w:rPr>
-                <w:sz w:val="16"/>
-                <w:szCs w:val="16"/>
+            <w:pPr>
+              <w:rPr>
+                <w:lang w:val="es-419"/>
+              </w:rPr>
+            </w:pPr>
+            <w:r>
+              <w:rPr>
+                <w:sz w:val="16"/>
+                <w:szCs w:val="16"/>
+                <w:lang w:val="es-419"/>
               </w:rPr>
               <w:t>Monto total, recalculado por trigger</w:t>
             </w:r>
@@ -16320,7 +16398,7 @@
       <w:pPr>
         <w:pStyle w:val="Heading2"/>
       </w:pPr>
-      <w:bookmarkStart w:id="16" w:name="_Toc234520385"/>
+      <w:bookmarkStart w:id="16" w:name="_Toc234521244"/>
       <w:r>
         <w:t>Procedimientos y funciones</w:t>
       </w:r>
@@ -17142,7 +17220,7 @@
           <w:lang w:val="es-419"/>
         </w:rPr>
       </w:pPr>
-      <w:bookmarkStart w:id="17" w:name="_Toc234520386"/>
+      <w:bookmarkStart w:id="17" w:name="_Toc234521245"/>
       <w:r>
         <w:rPr>
           <w:lang w:val="es-419"/>
@@ -17689,7 +17767,7 @@
       <w:pPr>
         <w:pStyle w:val="Heading2"/>
       </w:pPr>
-      <w:bookmarkStart w:id="18" w:name="_Toc234520387"/>
+      <w:bookmarkStart w:id="18" w:name="_Toc234521246"/>
       <w:r>
         <w:t>Arquitectura</w:t>
       </w:r>
@@ -17705,10 +17783,10 @@
         </w:rPr>
         <w:lastRenderedPageBreak/>
         <w:drawing>
-          <wp:inline distT="0" distB="0" distL="0" distR="0" wp14:anchorId="1A546D73" wp14:editId="70BCA6D5">
+          <wp:inline distT="0" distB="0" distL="0" distR="0" wp14:anchorId="2CF89CD0" wp14:editId="7BACF1A2">
             <wp:extent cx="5943600" cy="3543700"/>
-            <wp:effectExtent l="0" t="0" r="6350" b="9525"/>
-            <wp:docPr id="620910484" name="Picture 3"/>
+            <wp:effectExtent l="0" t="0" r="0" b="0"/>
+            <wp:docPr id="2067331797" name="Picture 1"/>
             <wp:cNvGraphicFramePr>
               <a:graphicFrameLocks xmlns:a="http://schemas.openxmlformats.org/drawingml/2006/main" noChangeAspect="1"/>
             </wp:cNvGraphicFramePr>
@@ -17716,7 +17794,7 @@
               <a:graphicData uri="http://schemas.openxmlformats.org/drawingml/2006/picture">
                 <pic:pic xmlns:pic="http://schemas.openxmlformats.org/drawingml/2006/picture">
                   <pic:nvPicPr>
-                    <pic:cNvPr id="0" name="Picture 5"/>
+                    <pic:cNvPr id="0" name="Picture 1"/>
                     <pic:cNvPicPr>
                       <a:picLocks noChangeAspect="1" noChangeArrowheads="1"/>
                     </pic:cNvPicPr>
@@ -17798,7 +17876,7 @@
           <w:lang w:val="es-419"/>
         </w:rPr>
       </w:pPr>
-      <w:bookmarkStart w:id="19" w:name="_Toc234520388"/>
+      <w:bookmarkStart w:id="19" w:name="_Toc234521247"/>
       <w:r>
         <w:rPr>
           <w:lang w:val="es-419"/>
@@ -17853,7 +17931,7 @@
       <w:pPr>
         <w:pStyle w:val="Heading1"/>
       </w:pPr>
-      <w:bookmarkStart w:id="20" w:name="_Toc234520389"/>
+      <w:bookmarkStart w:id="20" w:name="_Toc234521248"/>
       <w:r>
         <w:lastRenderedPageBreak/>
         <w:t>Bibliografía</w:t>

</xml_diff>